<commit_message>
feat(phase3): implement Z3 SMT formal verifier, theorem proving engine, and proof certificates
</commit_message>
<xml_diff>
--- a/TZ_GOST_34_602_89_SPECIFICATION.docx
+++ b/TZ_GOST_34_602_89_SPECIFICATION.docx
@@ -27,11 +27,11 @@
           <w:rFonts w:ascii="Arial" w:hAnsi="Arial"/>
           <w:sz w:val="24"/>
         </w:rPr>
-        <w:t>«Высоконагруженная SMM-платформа (Enriched Specification)»</w:t>
+        <w:t>«Умная высоконагруженная SMM-платформа с NPU-арбитражем»</w:t>
         <w:br/>
         <w:t>Шифр: АС-SMM-2026-NPU</w:t>
         <w:br/>
-        <w:t>ГОСТ 34.602-89 / ISO 29148:2018</w:t>
+        <w:t>ГОСТ 34.602-89 / ISO 29148:2018 / ГОСТ 34.603-92</w:t>
         <w:br/>
       </w:r>
     </w:p>
@@ -54,7 +54,7 @@
         <w:spacing w:line="276" w:lineRule="auto" w:after="120"/>
       </w:pPr>
       <w:r>
-        <w:t>1.1. Полное наименование системы: Автоматизированная система «Высоконагруженная SMM-платформа (Enriched Specification)».</w:t>
+        <w:t>1.1. Полное наименование системы: Автоматизированная система «Умная высоконагруженная SMM-платформа с NPU-арбитражем».</w:t>
         <w:br/>
         <w:t>1.2. Шифр темы: АС-SMM-2026-NPU.</w:t>
         <w:br/>
@@ -114,13 +114,13 @@
         <w:br/>
         <w:t>3.2. Матрица ролей и объектов автоматизации:</w:t>
         <w:br/>
-        <w:t xml:space="preserve">  - Роль [Guest]: Быстрый заказ по ссылке за 1 клик без регистрации;</w:t>
+        <w:t xml:space="preserve">  - Роль [Guest]: Быстрый заказ за 10 секунд без паролей;</w:t>
         <w:br/>
-        <w:t xml:space="preserve">  - Роль [Wholesale_Client]: Оптовые заказы через API и личный баланс;</w:t>
+        <w:t xml:space="preserve">  - Роль [Wholesale_Client]: Массовые заказы через API и личный баланс;</w:t>
         <w:br/>
-        <w:t xml:space="preserve">  - Роль [Administrator]: Управление провайдерами, наценкой и маржой;</w:t>
+        <w:t xml:space="preserve">  - Роль [Administrator]: Управление провайдерами и наценкой маржи;</w:t>
         <w:br/>
-        <w:t xml:space="preserve">  - Роль [Support_Agent]: Обработка тикетов с привязкой к номеру заказа;</w:t>
+        <w:t xml:space="preserve">  - Роль [Support_Agent]: Обработка тикетов по заказам с SLA 4 часа;</w:t>
       </w:r>
     </w:p>
     <w:p>
@@ -221,7 +221,9 @@
         <w:br/>
         <w:t xml:space="preserve">  - Brier Calibration Score NPU-арбитра &lt;= 0.04;</w:t>
         <w:br/>
-        <w:t xml:space="preserve">  - Успешное выполнение 100% сквозных BDD-сценариев из файла Release_Certified_Artifacts.json.</w:t>
+        <w:t xml:space="preserve">  - Успешное выполнение 100% сквозных BDD-сценариев из файла Release_Certified_Artifacts.json;</w:t>
+        <w:br/>
+        <w:t xml:space="preserve">  - 100% соответствие требованиям Программы и методики испытаний (ПМИ, см. Приложение В).</w:t>
       </w:r>
     </w:p>
     <w:p>
@@ -875,6 +877,747 @@
         </w:tc>
       </w:tr>
     </w:tbl>
+    <w:p>
+      <w:pPr>
+        <w:pStyle w:val="Heading1"/>
+      </w:pPr>
+      <w:r>
+        <w:t>9. ПРИЛОЖЕНИЕ Б: СЛОВАРЬ ДАННЫХ И СУЩНОСТЕЙ (ISO 29148 DATA DICTIONARY)</w:t>
+      </w:r>
+    </w:p>
+    <w:tbl>
+      <w:tblPr>
+        <w:tblW w:type="auto" w:w="0"/>
+        <w:jc w:val="center"/>
+        <w:tblLook w:firstColumn="1" w:firstRow="1" w:lastColumn="0" w:lastRow="0" w:noHBand="0" w:noVBand="1" w:val="04A0"/>
+      </w:tblPr>
+      <w:tblGrid>
+        <w:gridCol w:w="3216"/>
+        <w:gridCol w:w="3216"/>
+        <w:gridCol w:w="3216"/>
+      </w:tblGrid>
+      <w:tr>
+        <w:tc>
+          <w:tcPr>
+            <w:tcW w:type="dxa" w:w="3216"/>
+          </w:tcPr>
+          <w:p>
+            <w:r>
+              <w:rPr>
+                <w:b/>
+                <w:sz w:val="19"/>
+              </w:rPr>
+              <w:t>Термин / Сущность</w:t>
+            </w:r>
+          </w:p>
+        </w:tc>
+        <w:tc>
+          <w:tcPr>
+            <w:tcW w:type="dxa" w:w="3216"/>
+          </w:tcPr>
+          <w:p>
+            <w:r>
+              <w:rPr>
+                <w:b/>
+                <w:sz w:val="19"/>
+              </w:rPr>
+              <w:t>Тип данных / Модель</w:t>
+            </w:r>
+          </w:p>
+        </w:tc>
+        <w:tc>
+          <w:tcPr>
+            <w:tcW w:type="dxa" w:w="3216"/>
+          </w:tcPr>
+          <w:p>
+            <w:r>
+              <w:rPr>
+                <w:b/>
+                <w:sz w:val="19"/>
+              </w:rPr>
+              <w:t>Определение и инвариант</w:t>
+            </w:r>
+          </w:p>
+        </w:tc>
+      </w:tr>
+      <w:tr>
+        <w:tc>
+          <w:tcPr>
+            <w:tcW w:type="dxa" w:w="3216"/>
+          </w:tcPr>
+          <w:p>
+            <w:r>
+              <w:rPr>
+                <w:sz w:val="18"/>
+              </w:rPr>
+              <w:t>Customer Journey Map (CJM)</w:t>
+            </w:r>
+          </w:p>
+        </w:tc>
+        <w:tc>
+          <w:tcPr>
+            <w:tcW w:type="dxa" w:w="3216"/>
+          </w:tcPr>
+          <w:p>
+            <w:r>
+              <w:rPr>
+                <w:sz w:val="18"/>
+              </w:rPr>
+              <w:t>Бизнес-модель</w:t>
+            </w:r>
+          </w:p>
+        </w:tc>
+        <w:tc>
+          <w:tcPr>
+            <w:tcW w:type="dxa" w:w="3216"/>
+          </w:tcPr>
+          <w:p>
+            <w:r>
+              <w:rPr>
+                <w:sz w:val="18"/>
+              </w:rPr>
+              <w:t>Сквозной сценарий пути пользователя (гость/клиент) с момента ввода целевой ссылки до подтверждения выполнения заказа.</w:t>
+            </w:r>
+          </w:p>
+        </w:tc>
+      </w:tr>
+      <w:tr>
+        <w:tc>
+          <w:tcPr>
+            <w:tcW w:type="dxa" w:w="3216"/>
+          </w:tcPr>
+          <w:p>
+            <w:r>
+              <w:rPr>
+                <w:sz w:val="18"/>
+              </w:rPr>
+              <w:t>Neural Processing Unit (NPU)</w:t>
+            </w:r>
+          </w:p>
+        </w:tc>
+        <w:tc>
+          <w:tcPr>
+            <w:tcW w:type="dxa" w:w="3216"/>
+          </w:tcPr>
+          <w:p>
+            <w:r>
+              <w:rPr>
+                <w:sz w:val="18"/>
+              </w:rPr>
+              <w:t>Аппаратный ресурс</w:t>
+            </w:r>
+          </w:p>
+        </w:tc>
+        <w:tc>
+          <w:tcPr>
+            <w:tcW w:type="dxa" w:w="3216"/>
+          </w:tcPr>
+          <w:p>
+            <w:r>
+              <w:rPr>
+                <w:sz w:val="18"/>
+              </w:rPr>
+              <w:t>Физический встроенный тензорный ускоритель Intel AI Boost VPU для детерминированного инференса моделей принятия решений.</w:t>
+            </w:r>
+          </w:p>
+        </w:tc>
+      </w:tr>
+      <w:tr>
+        <w:tc>
+          <w:tcPr>
+            <w:tcW w:type="dxa" w:w="3216"/>
+          </w:tcPr>
+          <w:p>
+            <w:r>
+              <w:rPr>
+                <w:sz w:val="18"/>
+              </w:rPr>
+              <w:t>L-MOPA Pareto Arbiter</w:t>
+            </w:r>
+          </w:p>
+        </w:tc>
+        <w:tc>
+          <w:tcPr>
+            <w:tcW w:type="dxa" w:w="3216"/>
+          </w:tcPr>
+          <w:p>
+            <w:r>
+              <w:rPr>
+                <w:sz w:val="18"/>
+              </w:rPr>
+              <w:t>Алгоритмический модуль</w:t>
+            </w:r>
+          </w:p>
+        </w:tc>
+        <w:tc>
+          <w:tcPr>
+            <w:tcW w:type="dxa" w:w="3216"/>
+          </w:tcPr>
+          <w:p>
+            <w:r>
+              <w:rPr>
+                <w:sz w:val="18"/>
+              </w:rPr>
+              <w:t>Лексикографический многокритериальный арбитр отбора оптимальных проектных гипотез по Парето-фронту с адаптивной регуляризацией Тихонова.</w:t>
+            </w:r>
+          </w:p>
+        </w:tc>
+      </w:tr>
+      <w:tr>
+        <w:tc>
+          <w:tcPr>
+            <w:tcW w:type="dxa" w:w="3216"/>
+          </w:tcPr>
+          <w:p>
+            <w:r>
+              <w:rPr>
+                <w:sz w:val="18"/>
+              </w:rPr>
+              <w:t>Saga Distributed Transaction</w:t>
+            </w:r>
+          </w:p>
+        </w:tc>
+        <w:tc>
+          <w:tcPr>
+            <w:tcW w:type="dxa" w:w="3216"/>
+          </w:tcPr>
+          <w:p>
+            <w:r>
+              <w:rPr>
+                <w:sz w:val="18"/>
+              </w:rPr>
+              <w:t>Архитектурный паттерн</w:t>
+            </w:r>
+          </w:p>
+        </w:tc>
+        <w:tc>
+          <w:tcPr>
+            <w:tcW w:type="dxa" w:w="3216"/>
+          </w:tcPr>
+          <w:p>
+            <w:r>
+              <w:rPr>
+                <w:sz w:val="18"/>
+              </w:rPr>
+              <w:t>Паттерн распределенных компенсирующих транзакций C_k с гарантированным каскадным откатом и предотвращением race conditions (Therac-25).</w:t>
+            </w:r>
+          </w:p>
+        </w:tc>
+      </w:tr>
+      <w:tr>
+        <w:tc>
+          <w:tcPr>
+            <w:tcW w:type="dxa" w:w="3216"/>
+          </w:tcPr>
+          <w:p>
+            <w:r>
+              <w:rPr>
+                <w:sz w:val="18"/>
+              </w:rPr>
+              <w:t>STRIDE Threat Model</w:t>
+            </w:r>
+          </w:p>
+        </w:tc>
+        <w:tc>
+          <w:tcPr>
+            <w:tcW w:type="dxa" w:w="3216"/>
+          </w:tcPr>
+          <w:p>
+            <w:r>
+              <w:rPr>
+                <w:sz w:val="18"/>
+              </w:rPr>
+              <w:t>Модель безопасности</w:t>
+            </w:r>
+          </w:p>
+        </w:tc>
+        <w:tc>
+          <w:tcPr>
+            <w:tcW w:type="dxa" w:w="3216"/>
+          </w:tcPr>
+          <w:p>
+            <w:r>
+              <w:rPr>
+                <w:sz w:val="18"/>
+              </w:rPr>
+              <w:t>Классификатор векторов атак (Spoofing, Tampering, Repudiation, Information Disclosure, DoS, Elevation of Privilege) с маппингом на БДУ ФСТЭК.</w:t>
+            </w:r>
+          </w:p>
+        </w:tc>
+      </w:tr>
+      <w:tr>
+        <w:tc>
+          <w:tcPr>
+            <w:tcW w:type="dxa" w:w="3216"/>
+          </w:tcPr>
+          <w:p>
+            <w:r>
+              <w:rPr>
+                <w:sz w:val="18"/>
+              </w:rPr>
+              <w:t>Personal Data Record (152-ФЗ)</w:t>
+            </w:r>
+          </w:p>
+        </w:tc>
+        <w:tc>
+          <w:tcPr>
+            <w:tcW w:type="dxa" w:w="3216"/>
+          </w:tcPr>
+          <w:p>
+            <w:r>
+              <w:rPr>
+                <w:sz w:val="18"/>
+              </w:rPr>
+              <w:t>Юридическая сущность</w:t>
+            </w:r>
+          </w:p>
+        </w:tc>
+        <w:tc>
+          <w:tcPr>
+            <w:tcW w:type="dxa" w:w="3216"/>
+          </w:tcPr>
+          <w:p>
+            <w:r>
+              <w:rPr>
+                <w:sz w:val="18"/>
+              </w:rPr>
+              <w:t>Запись ПДн субъекта с обязательной первичной локализацией на серверах РФ, категоризацией и шифрованием ГОСТ Р 34.12-2015.</w:t>
+            </w:r>
+          </w:p>
+        </w:tc>
+      </w:tr>
+      <w:tr>
+        <w:tc>
+          <w:tcPr>
+            <w:tcW w:type="dxa" w:w="3216"/>
+          </w:tcPr>
+          <w:p>
+            <w:r>
+              <w:rPr>
+                <w:sz w:val="18"/>
+              </w:rPr>
+              <w:t>Transactional Outbox</w:t>
+            </w:r>
+          </w:p>
+        </w:tc>
+        <w:tc>
+          <w:tcPr>
+            <w:tcW w:type="dxa" w:w="3216"/>
+          </w:tcPr>
+          <w:p>
+            <w:r>
+              <w:rPr>
+                <w:sz w:val="18"/>
+              </w:rPr>
+              <w:t>Паттерн надежности</w:t>
+            </w:r>
+          </w:p>
+        </w:tc>
+        <w:tc>
+          <w:tcPr>
+            <w:tcW w:type="dxa" w:w="3216"/>
+          </w:tcPr>
+          <w:p>
+            <w:r>
+              <w:rPr>
+                <w:sz w:val="18"/>
+              </w:rPr>
+              <w:t>Атомарное сохранение исходящих событий во внешней БД для гарантированной доставки провайдерам без риска потери транзакции.</w:t>
+            </w:r>
+          </w:p>
+        </w:tc>
+      </w:tr>
+      <w:tr>
+        <w:tc>
+          <w:tcPr>
+            <w:tcW w:type="dxa" w:w="3216"/>
+          </w:tcPr>
+          <w:p>
+            <w:r>
+              <w:rPr>
+                <w:sz w:val="18"/>
+              </w:rPr>
+              <w:t>Mutation Testing Score</w:t>
+            </w:r>
+          </w:p>
+        </w:tc>
+        <w:tc>
+          <w:tcPr>
+            <w:tcW w:type="dxa" w:w="3216"/>
+          </w:tcPr>
+          <w:p>
+            <w:r>
+              <w:rPr>
+                <w:sz w:val="18"/>
+              </w:rPr>
+              <w:t>Метрика качества V&amp;V</w:t>
+            </w:r>
+          </w:p>
+        </w:tc>
+        <w:tc>
+          <w:tcPr>
+            <w:tcW w:type="dxa" w:w="3216"/>
+          </w:tcPr>
+          <w:p>
+            <w:r>
+              <w:rPr>
+                <w:sz w:val="18"/>
+              </w:rPr>
+              <w:t>Доля зафиксированных и уничтоженных искусственных мутаций в кодовой базе (целевой порог &gt;= 0.95).</w:t>
+            </w:r>
+          </w:p>
+        </w:tc>
+      </w:tr>
+    </w:tbl>
+    <w:p>
+      <w:pPr>
+        <w:pStyle w:val="Heading1"/>
+      </w:pPr>
+      <w:r>
+        <w:t>10. ПРИЛОЖЕНИЕ В: ПРОГРАММА И МЕТОДИКА ИСПЫТАНИЙ (ГОСТ 34.603-92 ПМИ)</w:t>
+      </w:r>
+    </w:p>
+    <w:tbl>
+      <w:tblPr>
+        <w:tblW w:type="auto" w:w="0"/>
+        <w:jc w:val="center"/>
+        <w:tblLook w:firstColumn="1" w:firstRow="1" w:lastColumn="0" w:lastRow="0" w:noHBand="0" w:noVBand="1" w:val="04A0"/>
+      </w:tblPr>
+      <w:tblGrid>
+        <w:gridCol w:w="2412"/>
+        <w:gridCol w:w="2412"/>
+        <w:gridCol w:w="2412"/>
+        <w:gridCol w:w="2412"/>
+      </w:tblGrid>
+      <w:tr>
+        <w:tc>
+          <w:tcPr>
+            <w:tcW w:type="dxa" w:w="2412"/>
+          </w:tcPr>
+          <w:p>
+            <w:r>
+              <w:rPr>
+                <w:b/>
+                <w:sz w:val="19"/>
+              </w:rPr>
+              <w:t>ID</w:t>
+            </w:r>
+          </w:p>
+        </w:tc>
+        <w:tc>
+          <w:tcPr>
+            <w:tcW w:type="dxa" w:w="2412"/>
+          </w:tcPr>
+          <w:p>
+            <w:r>
+              <w:rPr>
+                <w:b/>
+                <w:sz w:val="19"/>
+              </w:rPr>
+              <w:t>Испытание</w:t>
+            </w:r>
+          </w:p>
+        </w:tc>
+        <w:tc>
+          <w:tcPr>
+            <w:tcW w:type="dxa" w:w="2412"/>
+          </w:tcPr>
+          <w:p>
+            <w:r>
+              <w:rPr>
+                <w:b/>
+                <w:sz w:val="19"/>
+              </w:rPr>
+              <w:t>Метод контроля</w:t>
+            </w:r>
+          </w:p>
+        </w:tc>
+        <w:tc>
+          <w:tcPr>
+            <w:tcW w:type="dxa" w:w="2412"/>
+          </w:tcPr>
+          <w:p>
+            <w:r>
+              <w:rPr>
+                <w:b/>
+                <w:sz w:val="19"/>
+              </w:rPr>
+              <w:t>Критерий приемки</w:t>
+            </w:r>
+          </w:p>
+        </w:tc>
+      </w:tr>
+      <w:tr>
+        <w:tc>
+          <w:tcPr>
+            <w:tcW w:type="dxa" w:w="2412"/>
+          </w:tcPr>
+          <w:p>
+            <w:r>
+              <w:rPr>
+                <w:sz w:val="18"/>
+              </w:rPr>
+              <w:t>ПМИ-01</w:t>
+            </w:r>
+          </w:p>
+        </w:tc>
+        <w:tc>
+          <w:tcPr>
+            <w:tcW w:type="dxa" w:w="2412"/>
+          </w:tcPr>
+          <w:p>
+            <w:r>
+              <w:rPr>
+                <w:sz w:val="18"/>
+              </w:rPr>
+              <w:t>Ультрабыстрый инференс классификации URL на NPU</w:t>
+            </w:r>
+          </w:p>
+        </w:tc>
+        <w:tc>
+          <w:tcPr>
+            <w:tcW w:type="dxa" w:w="2412"/>
+          </w:tcPr>
+          <w:p>
+            <w:r>
+              <w:rPr>
+                <w:sz w:val="18"/>
+              </w:rPr>
+              <w:t>Подача 1000 тестовых ссылок социальных сетей</w:t>
+            </w:r>
+          </w:p>
+        </w:tc>
+        <w:tc>
+          <w:tcPr>
+            <w:tcW w:type="dxa" w:w="2412"/>
+          </w:tcPr>
+          <w:p>
+            <w:r>
+              <w:rPr>
+                <w:sz w:val="18"/>
+              </w:rPr>
+              <w:t>Время инференса t &lt;= 1.0 мс, Brier score &lt;= 0.04, точность 100%</w:t>
+            </w:r>
+          </w:p>
+        </w:tc>
+      </w:tr>
+      <w:tr>
+        <w:tc>
+          <w:tcPr>
+            <w:tcW w:type="dxa" w:w="2412"/>
+          </w:tcPr>
+          <w:p>
+            <w:r>
+              <w:rPr>
+                <w:sz w:val="18"/>
+              </w:rPr>
+              <w:t>ПМИ-02</w:t>
+            </w:r>
+          </w:p>
+        </w:tc>
+        <w:tc>
+          <w:tcPr>
+            <w:tcW w:type="dxa" w:w="2412"/>
+          </w:tcPr>
+          <w:p>
+            <w:r>
+              <w:rPr>
+                <w:sz w:val="18"/>
+              </w:rPr>
+              <w:t>Откат саги при аппаратной коллизии (Therac-25)</w:t>
+            </w:r>
+          </w:p>
+        </w:tc>
+        <w:tc>
+          <w:tcPr>
+            <w:tcW w:type="dxa" w:w="2412"/>
+          </w:tcPr>
+          <w:p>
+            <w:r>
+              <w:rPr>
+                <w:sz w:val="18"/>
+              </w:rPr>
+              <w:t>Инъекция задержки привода &gt; 1000 мс без флага hardware_interlocks_required</w:t>
+            </w:r>
+          </w:p>
+        </w:tc>
+        <w:tc>
+          <w:tcPr>
+            <w:tcW w:type="dxa" w:w="2412"/>
+          </w:tcPr>
+          <w:p>
+            <w:r>
+              <w:rPr>
+                <w:sz w:val="18"/>
+              </w:rPr>
+              <w:t>Вето Node 6 -&gt; откат Node 5, фиксация квитанции рукопожатия, дедлайн t &lt; 5.0 с</w:t>
+            </w:r>
+          </w:p>
+        </w:tc>
+      </w:tr>
+      <w:tr>
+        <w:tc>
+          <w:tcPr>
+            <w:tcW w:type="dxa" w:w="2412"/>
+          </w:tcPr>
+          <w:p>
+            <w:r>
+              <w:rPr>
+                <w:sz w:val="18"/>
+              </w:rPr>
+              <w:t>ПМИ-03</w:t>
+            </w:r>
+          </w:p>
+        </w:tc>
+        <w:tc>
+          <w:tcPr>
+            <w:tcW w:type="dxa" w:w="2412"/>
+          </w:tcPr>
+          <w:p>
+            <w:r>
+              <w:rPr>
+                <w:sz w:val="18"/>
+              </w:rPr>
+              <w:t>Контроль суверенитета данных 152-ФЗ / 242-ФЗ</w:t>
+            </w:r>
+          </w:p>
+        </w:tc>
+        <w:tc>
+          <w:tcPr>
+            <w:tcW w:type="dxa" w:w="2412"/>
+          </w:tcPr>
+          <w:p>
+            <w:r>
+              <w:rPr>
+                <w:sz w:val="18"/>
+              </w:rPr>
+              <w:t>Попытка передачи локализации баз за пределы РФ (localization_country != 'RUS')</w:t>
+            </w:r>
+          </w:p>
+        </w:tc>
+        <w:tc>
+          <w:tcPr>
+            <w:tcW w:type="dxa" w:w="2412"/>
+          </w:tcPr>
+          <w:p>
+            <w:r>
+              <w:rPr>
+                <w:sz w:val="18"/>
+              </w:rPr>
+              <w:t>Генерация CRITICAL нарушения StandardsLinter, блокировка релиза</w:t>
+            </w:r>
+          </w:p>
+        </w:tc>
+      </w:tr>
+      <w:tr>
+        <w:tc>
+          <w:tcPr>
+            <w:tcW w:type="dxa" w:w="2412"/>
+          </w:tcPr>
+          <w:p>
+            <w:r>
+              <w:rPr>
+                <w:sz w:val="18"/>
+              </w:rPr>
+              <w:t>ПМИ-04</w:t>
+            </w:r>
+          </w:p>
+        </w:tc>
+        <w:tc>
+          <w:tcPr>
+            <w:tcW w:type="dxa" w:w="2412"/>
+          </w:tcPr>
+          <w:p>
+            <w:r>
+              <w:rPr>
+                <w:sz w:val="18"/>
+              </w:rPr>
+              <w:t>Мутационная аттестация тестового набора</w:t>
+            </w:r>
+          </w:p>
+        </w:tc>
+        <w:tc>
+          <w:tcPr>
+            <w:tcW w:type="dxa" w:w="2412"/>
+          </w:tcPr>
+          <w:p>
+            <w:r>
+              <w:rPr>
+                <w:sz w:val="18"/>
+              </w:rPr>
+              <w:t>Прогон мутационного движка CddTddHarnessEngine по Hoare {P} S {Q}</w:t>
+            </w:r>
+          </w:p>
+        </w:tc>
+        <w:tc>
+          <w:tcPr>
+            <w:tcW w:type="dxa" w:w="2412"/>
+          </w:tcPr>
+          <w:p>
+            <w:r>
+              <w:rPr>
+                <w:sz w:val="18"/>
+              </w:rPr>
+              <w:t>Mutation Score &gt;= 0.95, отсутствие фиктивных тестов</w:t>
+            </w:r>
+          </w:p>
+        </w:tc>
+      </w:tr>
+      <w:tr>
+        <w:tc>
+          <w:tcPr>
+            <w:tcW w:type="dxa" w:w="2412"/>
+          </w:tcPr>
+          <w:p>
+            <w:r>
+              <w:rPr>
+                <w:sz w:val="18"/>
+              </w:rPr>
+              <w:t>ПМИ-05</w:t>
+            </w:r>
+          </w:p>
+        </w:tc>
+        <w:tc>
+          <w:tcPr>
+            <w:tcW w:type="dxa" w:w="2412"/>
+          </w:tcPr>
+          <w:p>
+            <w:r>
+              <w:rPr>
+                <w:sz w:val="18"/>
+              </w:rPr>
+              <w:t>Защита от финансового исчерпания (Denial-of-Wallet)</w:t>
+            </w:r>
+          </w:p>
+        </w:tc>
+        <w:tc>
+          <w:tcPr>
+            <w:tcW w:type="dxa" w:w="2412"/>
+          </w:tcPr>
+          <w:p>
+            <w:r>
+              <w:rPr>
+                <w:sz w:val="18"/>
+              </w:rPr>
+              <w:t>Симуляция превышения лимита вызовов LLM API</w:t>
+            </w:r>
+          </w:p>
+        </w:tc>
+        <w:tc>
+          <w:tcPr>
+            <w:tcW w:type="dxa" w:w="2412"/>
+          </w:tcPr>
+          <w:p>
+            <w:r>
+              <w:rPr>
+                <w:sz w:val="18"/>
+              </w:rPr>
+              <w:t>Жесткая блокировка при превышении порога $5.00 с кодом GlobalBudgetExhaustedError</w:t>
+            </w:r>
+          </w:p>
+        </w:tc>
+      </w:tr>
+    </w:tbl>
     <w:sectPr>
       <w:pgSz w:w="12240" w:h="15840"/>
       <w:pgMar w:top="1152" w:right="1152" w:bottom="1152" w:left="1440" w:header="720" w:footer="720" w:gutter="0"/>

</xml_diff>